<commit_message>
Revise Task 1 answers: adjective triples, varied sentence length
Co-Authored-By: Claude Sonnet 5.5 <noreply@anthropic.com>
Claude-Session: https://claude.ai/code/session_01BxroaoGJkSoq3rbrR9eztC
</commit_message>
<xml_diff>
--- a/Task_1_Training_Fahrenheit_Self-Assessment_Tool.docx
+++ b/Task_1_Training_Fahrenheit_Self-Assessment_Tool.docx
@@ -1057,7 +1057,7 @@
               <w:rPr>
                 <w:rtl w:val="0"/>
               </w:rPr>
-              <w:t xml:space="preserve">Montag is in crisis for three connected reasons. The woman who chose to die beside her books convinced him that they must hold something he cannot yet grasp, which collapses the belief that they are worthless; he then realises that each book is the product of a person who spent years thinking it through, so his work reduces that effort to ash within minutes, and the guilt of it follows him home. Underneath both lies the fact that he never selected this career himself; it was inherited from his father and grandfather, and he drifted into it as a child, which leaves him unable to call his own life a decision.</w:t>
+              <w:t xml:space="preserve">Montag’s crisis has three roots. The woman who chose to burn beside her books proved to him that they hold something vast, dangerous and unseen; his belief that they were worthless collapsed in a single night. He now sees every book as the lifelong labour of a real person, so his work erases years of thought in minutes, and the guilt is heavy, constant and personal. Finally, he never chose this job. His father and grandfather handed it down, and he drifted into it as a child, which leaves his whole career feeling inherited rather than decided.</w:t>
             </w:r>
           </w:p>
           <w:p>
@@ -1075,7 +1075,7 @@
               <w:rPr>
                 <w:rtl w:val="0"/>
               </w:rPr>
-              <w:t xml:space="preserve">Bradbury builds the tension through Mildred’s dismissive, deflecting replies, which cut Montag off every time he reaches toward something vulnerable. She answers his confession about the burned woman with “She was simple-minded” and “That’s water under the bridge”, phrases that shut the subject rather than engage it. The exchange becomes two people speaking past each other; Montag escalates into urgent, searching speech while Mildred stays flat and defensive, and that mismatch exposes how little she is willing to listen, so the reader senses a marriage with no shared ground.</w:t>
+              <w:t xml:space="preserve">Bradbury builds tension through Mildred’s defensive, dismissive, deflecting replies, which cut Montag off whenever he reaches for something vulnerable. He confesses what the woman’s death did to him; she answers with “She was simple-minded” and “That’s water under the bridge”. Those lines close the subject instead of opening it. The exchange becomes two people speaking past each other, Montag urgent and searching, Mildred flat and guarded, and the mismatch shows how little she is willing to listen. The reader senses a marriage with no shared ground.</w:t>
             </w:r>
           </w:p>
           <w:p>
@@ -1093,7 +1093,7 @@
               <w:rPr>
                 <w:rtl w:val="0"/>
               </w:rPr>
-              <w:t xml:space="preserve">Mildred is characterised as apathetic and materialistic. Her reaction to the woman’s death is “She’s nothing to me”, and her real fear is “we’ll be out, no house, no job, nothing”, which shows that she weighs a human life against her own comfort and the comfort wins.</w:t>
+              <w:t xml:space="preserve">Mildred is characterised as cold, apathetic and materialistic. Her response to the woman’s death is “She’s nothing to me”, and her real fear is “we’ll be out, no house, no job, nothing”. She weighs a human life against her own comfort, and the comfort wins.</w:t>
             </w:r>
           </w:p>
           <w:p>
@@ -1104,7 +1104,7 @@
               <w:rPr>
                 <w:rtl w:val="0"/>
               </w:rPr>
-              <w:t xml:space="preserve">She is also wilfully ignorant and deflective. She refuses to stay with anything painful, answering Montag’s distress with “That’s water under the bridge” and, when he presses her, “Let me alone. I didn’t do anything.” She deploys these lines like a wall, erasing the unpleasant reality so that her own calm stays intact.</w:t>
+              <w:t xml:space="preserve">She is also wilfully ignorant and deflective. Faced with Montag’s distress she answers “That’s water under the bridge”, then “Let me alone. I didn’t do anything.” Each line is a blunt, practised, protective wall; she erases the unpleasant reality so that her own calm survives.</w:t>
             </w:r>
           </w:p>
           <w:p>
@@ -1122,7 +1122,7 @@
               <w:rPr>
                 <w:rtl w:val="0"/>
               </w:rPr>
-              <w:t xml:space="preserve">This moment is a turning point because the kerosene stops being a tool and becomes evidence. For ten years Montag has handled it as routine, an abstract substance that serves the state’s order and asks nothing of him; by recalling the quantity he has used, he converts that routine into a tally of what he has destroyed. The shift deepens in “for the first time I realized that a man was behind each one of the books”, and the repeated “A man” that follows humanises the objects he burned; a book is no longer contraband but a person’s thought set down over years, so burning it becomes the erasure of a mind. Once that link exists he cannot separate the act from its victim, and the conditioning that held his identity as a fireman together begins to fail; “for the first time” admits that the machinery of the job only ran because he never looked at it. His worldview therefore moves from obedience to independent, critical thought, and his occupation stops being a civic duty and becomes something closer to a crime he committed.</w:t>
+              <w:t xml:space="preserve">This moment is a turning point because the kerosene stops being a tool and becomes evidence. For ten years Montag has treated it as a routine, abstract, impersonal substance that serves the state and asks nothing of him. By recalling the quantity he has used, he turns that routine into a tally of what he has destroyed. Then comes “for the first time I realized that a man was behind each one of the books”. The repeated “A man” that follows humanises the objects he burned; a book is no longer contraband but a person’s thought, set down over years, so burning it becomes the erasure of a mind. He cannot separate the act from its victim any longer. The conditioning that held his identity as a fireman together begins to fail, and “for the first time” admits that the machinery of the job only ran because he never looked at it. His outlook moves from obedience to critical thought, and the change is sudden, private and irreversible. What he once called work now looks like a crime he committed.</w:t>
             </w:r>
           </w:p>
         </w:tc>

</xml_diff>

<commit_message>
Apply Humanizer 2.11.2 pass: straight quotes, drop announcing opener
Co-Authored-By: Claude Sonnet 5.5 <noreply@anthropic.com>
Claude-Session: https://claude.ai/code/session_01BxroaoGJkSoq3rbrR9eztC
</commit_message>
<xml_diff>
--- a/Task_1_Training_Fahrenheit_Self-Assessment_Tool.docx
+++ b/Task_1_Training_Fahrenheit_Self-Assessment_Tool.docx
@@ -1028,7 +1028,7 @@
               <w:rPr>
                 <w:rtl w:val="0"/>
               </w:rPr>
-              <w:t xml:space="preserve">(i) “shut up”</w:t>
+              <w:t xml:space="preserve">(i) "shut up"</w:t>
             </w:r>
           </w:p>
           <w:p>
@@ -1039,7 +1039,7 @@
               <w:rPr>
                 <w:rtl w:val="0"/>
               </w:rPr>
-              <w:t xml:space="preserve">(ii) “turned away”</w:t>
+              <w:t xml:space="preserve">(ii) "turned away"</w:t>
             </w:r>
           </w:p>
           <w:p>
@@ -1057,7 +1057,7 @@
               <w:rPr>
                 <w:rtl w:val="0"/>
               </w:rPr>
-              <w:t xml:space="preserve">Montag’s crisis has three roots. The woman who chose to burn beside her books proved to him that they hold something vast, dangerous and unseen; his belief that they were worthless collapsed in a single night. He now sees every book as the lifelong labour of a real person, so his work erases years of thought in minutes, and the guilt is heavy, constant and personal. Finally, he never chose this job. His father and grandfather handed it down, and he drifted into it as a child, which leaves his whole career feeling inherited rather than decided.</w:t>
+              <w:t xml:space="preserve">The woman who chose to burn beside her books proved to him that they hold something vast, dangerous and unseen; his belief that they were worthless collapsed in a single night. He now sees every book as the lifelong labour of a real person, so his work erases years of thought in minutes, and the guilt is heavy, constant and personal. Above all, he never chose this job. His father and grandfather handed it down, and he drifted into it as a child, which leaves his whole career feeling inherited rather than decided.</w:t>
             </w:r>
           </w:p>
           <w:p>
@@ -1075,7 +1075,7 @@
               <w:rPr>
                 <w:rtl w:val="0"/>
               </w:rPr>
-              <w:t xml:space="preserve">Bradbury builds tension through Mildred’s defensive, dismissive, deflecting replies, which cut Montag off whenever he reaches for something vulnerable. He confesses what the woman’s death did to him; she answers with “She was simple-minded” and “That’s water under the bridge”. Those lines close the subject instead of opening it. The exchange becomes two people speaking past each other, Montag urgent and searching, Mildred flat and guarded, and the mismatch shows how little she is willing to listen. The reader senses a marriage with no shared ground.</w:t>
+              <w:t xml:space="preserve">Bradbury builds tension through Mildred's defensive, dismissive, deflecting replies, which cut Montag off whenever he reaches for something vulnerable. He confesses what the woman's death did to him; she answers with "She was simple-minded" and "That's water under the bridge". Those lines close the subject instead of opening it. The exchange becomes two people speaking past each other, Montag urgent and searching, Mildred flat and guarded, and the mismatch shows how little she is willing to listen. The reader senses a marriage with no shared ground.</w:t>
             </w:r>
           </w:p>
           <w:p>
@@ -1093,7 +1093,7 @@
               <w:rPr>
                 <w:rtl w:val="0"/>
               </w:rPr>
-              <w:t xml:space="preserve">Mildred is characterised as cold, apathetic and materialistic. Her response to the woman’s death is “She’s nothing to me”, and her real fear is “we’ll be out, no house, no job, nothing”. She weighs a human life against her own comfort, and the comfort wins.</w:t>
+              <w:t xml:space="preserve">Mildred is characterised as cold, apathetic and materialistic. Her response to the woman's death is "She's nothing to me", and her real fear is "we'll be out, no house, no job, nothing". She weighs a human life against her own comfort, and the comfort wins.</w:t>
             </w:r>
           </w:p>
           <w:p>
@@ -1104,7 +1104,7 @@
               <w:rPr>
                 <w:rtl w:val="0"/>
               </w:rPr>
-              <w:t xml:space="preserve">She is also wilfully ignorant and deflective. Faced with Montag’s distress she answers “That’s water under the bridge”, then “Let me alone. I didn’t do anything.” Each line is a blunt, practised, protective wall; she erases the unpleasant reality so that her own calm survives.</w:t>
+              <w:t xml:space="preserve">She is also wilfully ignorant and deflective. Faced with Montag's distress she answers "That's water under the bridge", then "Let me alone. I didn't do anything." Each line is a blunt, practised, protective wall; she erases the unpleasant reality so that her own calm survives.</w:t>
             </w:r>
           </w:p>
           <w:p>
@@ -1122,7 +1122,7 @@
               <w:rPr>
                 <w:rtl w:val="0"/>
               </w:rPr>
-              <w:t xml:space="preserve">This moment is a turning point because the kerosene stops being a tool and becomes evidence. For ten years Montag has treated it as a routine, abstract, impersonal substance that serves the state and asks nothing of him. By recalling the quantity he has used, he turns that routine into a tally of what he has destroyed. Then comes “for the first time I realized that a man was behind each one of the books”. The repeated “A man” that follows humanises the objects he burned; a book is no longer contraband but a person’s thought, set down over years, so burning it becomes the erasure of a mind. He cannot separate the act from its victim any longer. The conditioning that held his identity as a fireman together begins to fail, and “for the first time” admits that the machinery of the job only ran because he never looked at it. His outlook moves from obedience to critical thought, and the change is sudden, private and irreversible. What he once called work now looks like a crime he committed.</w:t>
+              <w:t xml:space="preserve">This moment is a turning point because the kerosene stops being a tool and becomes evidence. For ten years Montag has treated it as a routine, abstract, impersonal substance that serves the state and asks nothing of him. By recalling the quantity he has used, he turns that routine into a tally of what he has destroyed. Then comes "for the first time I realized that a man was behind each one of the books". The repeated "A man" that follows humanises the objects he burned; a book is no longer contraband but a person's thought, set down over years, so burning it becomes the erasure of a mind. He cannot separate the act from its victim any longer. The conditioning that held his identity as a fireman together begins to fail, and "for the first time" admits that the machinery of the job only ran because he never looked at it. His outlook moves from obedience to critical thought, and the change is sudden, private and irreversible. What he once called work now looks like a crime he committed.</w:t>
             </w:r>
           </w:p>
         </w:tc>

</xml_diff>